<commit_message>
fix(dao): lot D — AE du contrat-cadre, un pourcentage n'imprime plus « % % » (six jetons en .chiffres, dont les interets moratoires), garde-fou dans decrire.mjs
Co-Authored-By: Claude Opus 5.5 <noreply@anthropic.com>
</commit_message>
<xml_diff>
--- a/docs/modeles-dao/AE-CC.docx
+++ b/docs/modeles-dao/AE-CC.docx
@@ -2521,7 +2521,7 @@
           <w:b w:val="off"/>
           <w:sz w:val="22"/>
         </w:rPr>
-        <w:t>A chaque complétude de l’offre, l’augmentation des prix détaillés dans le bordereau de prix unitaires joint au présent accord sera limitée à {{B05-PM-04}} %.</w:t>
+        <w:t>A chaque complétude de l’offre, l’augmentation des prix détaillés dans le bordereau de prix unitaires joint au présent accord sera limitée à {{B05-PM-04.chiffres}} %.</w:t>
       </w:r>
     </w:p>
     <w:p>
@@ -2573,7 +2573,7 @@
           <w:b w:val="off"/>
           <w:sz w:val="22"/>
         </w:rPr>
-        <w:t>A chaque complétude de l’offre, l’augmentation des prix détaillés dans le catalogue joint au présent accord sera limitée à {{B05-PM-04}} %.</w:t>
+        <w:t>A chaque complétude de l’offre, l’augmentation des prix détaillés dans le catalogue joint au présent accord sera limitée à {{B05-PM-04.chiffres}} %.</w:t>
       </w:r>
     </w:p>
     <w:p>
@@ -2651,7 +2651,7 @@
           <w:b w:val="off"/>
           <w:sz w:val="22"/>
         </w:rPr>
-        <w:t>A chaque complétude de l’offre, l’augmentation de ce montant sera limitée à {{B05-PM-04}} %.</w:t>
+        <w:t>A chaque complétude de l’offre, l’augmentation de ce montant sera limitée à {{B05-PM-04.chiffres}} %.</w:t>
       </w:r>
     </w:p>
     <w:p>
@@ -2794,7 +2794,7 @@
           <w:b w:val="off"/>
           <w:sz w:val="22"/>
         </w:rPr>
-        <w:t>A chaque remise en concurrence l’augmentation des prix détaillés dans le bordereau de prix joint au présent accord sera limitée à {{B05-PM-04}} %.</w:t>
+        <w:t>A chaque remise en concurrence l’augmentation des prix détaillés dans le bordereau de prix joint au présent accord sera limitée à {{B05-PM-04.chiffres}} %.</w:t>
       </w:r>
     </w:p>
     <w:p>
@@ -3119,7 +3119,7 @@
           <w:b w:val="off"/>
           <w:sz w:val="22"/>
         </w:rPr>
-        <w:t>Le montant de l’avance des marchés conclus sur la base du contrat-cadre est fixé à {{B08-AV-02}} % du montant TTC du marché subséquent.</w:t>
+        <w:t>Le montant de l’avance des marchés conclus sur la base du contrat-cadre est fixé à {{B08-AV-02.chiffres}} % du montant TTC du marché subséquent.</w:t>
       </w:r>
     </w:p>
     <w:p>
@@ -3899,7 +3899,7 @@
           <w:b w:val="off"/>
           <w:sz w:val="22"/>
         </w:rPr>
-        <w:t>Le délai de paiement est de 75 jours à compter de la réception de la demande de paiement. Aucune demande de paiement ne peut être transmise avant réalisation des prestations. Le taux applicable en cas de retard de paiement est le taux d’intérêt de la Banque Centrale de Madagascar en vigueur, à la date à laquelle les intérêts moratoires ont commencé à courir, augmenté de {{B08-FP-04}} point(s).</w:t>
+        <w:t>Le délai de paiement est de 75 jours à compter de la réception de la demande de paiement. Aucune demande de paiement ne peut être transmise avant réalisation des prestations. Le taux applicable en cas de retard de paiement est le taux d’intérêt de la Banque Centrale de Madagascar en vigueur, à la date à laquelle les intérêts moratoires ont commencé à courir, augmenté de {{B08-FP-04.chiffres}} point(s).</w:t>
       </w:r>
     </w:p>
     <w:p>

</xml_diff>

<commit_message>
feat(dao): lot D4 — la fiche DAO des travaux au format officiel : marche ordinaire (DPAO-T 247/247, AE-T 363/363, CCAP-T et ses six annexes 570/570) et contrat-cadre de travaux (DPAC-CC / AE-CC : choix « CCAG Travaux » par la categorie) ; banc de lecture etendu (Q10 tenu) ; demande backend T-1/T-2 (champs, corrections, harmonisation des codes du contrat-cadre)
Co-Authored-By: Claude Opus 5.5 (1M context) <noreply@anthropic.com>
</commit_message>
<xml_diff>
--- a/docs/modeles-dao/AE-CC.docx
+++ b/docs/modeles-dao/AE-CC.docx
@@ -1793,7 +1793,72 @@
           <w:b w:val="off"/>
           <w:sz w:val="22"/>
         </w:rPr>
+        <w:t>{{SI:CCAG-FOURNITURES}}</w:t>
+      </w:r>
+    </w:p>
+    <w:p>
+      <w:pPr>
+        <w:spacing w:after="120"/>
+        <w:jc w:val="both"/>
+      </w:pPr>
+      <w:r>
+        <w:rPr>
+          <w:b w:val="off"/>
+          <w:sz w:val="22"/>
+        </w:rPr>
         <w:t>• Le cahier des clauses administratives générales applicables aux marchés publics de Fournitures courantes et services.</w:t>
+      </w:r>
+    </w:p>
+    <w:p>
+      <w:pPr>
+        <w:spacing w:after="120"/>
+        <w:jc w:val="both"/>
+      </w:pPr>
+      <w:r>
+        <w:rPr>
+          <w:b w:val="off"/>
+          <w:sz w:val="22"/>
+        </w:rPr>
+        <w:t>{{FINSI:CCAG-FOURNITURES}}</w:t>
+      </w:r>
+    </w:p>
+    <w:p>
+      <w:pPr>
+        <w:spacing w:after="120"/>
+        <w:jc w:val="both"/>
+      </w:pPr>
+      <w:r>
+        <w:rPr>
+          <w:b w:val="off"/>
+          <w:sz w:val="22"/>
+        </w:rPr>
+        <w:t>{{SI:CCAG-TRAVAUX}}</w:t>
+      </w:r>
+    </w:p>
+    <w:p>
+      <w:pPr>
+        <w:spacing w:after="120"/>
+        <w:jc w:val="both"/>
+      </w:pPr>
+      <w:r>
+        <w:rPr>
+          <w:b w:val="off"/>
+          <w:sz w:val="22"/>
+        </w:rPr>
+        <w:t>• Le cahier des clauses administratives générales applicables aux marchés de travaux.</w:t>
+      </w:r>
+    </w:p>
+    <w:p>
+      <w:pPr>
+        <w:spacing w:after="120"/>
+        <w:jc w:val="both"/>
+      </w:pPr>
+      <w:r>
+        <w:rPr>
+          <w:b w:val="off"/>
+          <w:sz w:val="22"/>
+        </w:rPr>
+        <w:t>{{FINSI:CCAG-TRAVAUX}}</w:t>
       </w:r>
     </w:p>
     <w:p>
@@ -2339,7 +2404,72 @@
           <w:b w:val="off"/>
           <w:sz w:val="22"/>
         </w:rPr>
+        <w:t>{{SI:CCAG-FOURNITURES}}</w:t>
+      </w:r>
+    </w:p>
+    <w:p>
+      <w:pPr>
+        <w:spacing w:after="120"/>
+        <w:jc w:val="both"/>
+      </w:pPr>
+      <w:r>
+        <w:rPr>
+          <w:b w:val="off"/>
+          <w:sz w:val="22"/>
+        </w:rPr>
         <w:t>Conformément à l’article 12 du CCAG Fournitures et Services il sera appliqué sans mise en demeure préalable, des pénalités en cas de retard dans l’exécution des marchés passés sur la base du présent contrat.</w:t>
+      </w:r>
+    </w:p>
+    <w:p>
+      <w:pPr>
+        <w:spacing w:after="120"/>
+        <w:jc w:val="both"/>
+      </w:pPr>
+      <w:r>
+        <w:rPr>
+          <w:b w:val="off"/>
+          <w:sz w:val="22"/>
+        </w:rPr>
+        <w:t>{{FINSI:CCAG-FOURNITURES}}</w:t>
+      </w:r>
+    </w:p>
+    <w:p>
+      <w:pPr>
+        <w:spacing w:after="120"/>
+        <w:jc w:val="both"/>
+      </w:pPr>
+      <w:r>
+        <w:rPr>
+          <w:b w:val="off"/>
+          <w:sz w:val="22"/>
+        </w:rPr>
+        <w:t>{{SI:CCAG-TRAVAUX}}</w:t>
+      </w:r>
+    </w:p>
+    <w:p>
+      <w:pPr>
+        <w:spacing w:after="120"/>
+        <w:jc w:val="both"/>
+      </w:pPr>
+      <w:r>
+        <w:rPr>
+          <w:b w:val="off"/>
+          <w:sz w:val="22"/>
+        </w:rPr>
+        <w:t>Conformément à l’article 20 du CCAG Travaux il sera appliqué sans mise en demeure préalable, des pénalités en cas de retard dans l’exécution des marchés passés sur la base du présent contrat.</w:t>
+      </w:r>
+    </w:p>
+    <w:p>
+      <w:pPr>
+        <w:spacing w:after="120"/>
+        <w:jc w:val="both"/>
+      </w:pPr>
+      <w:r>
+        <w:rPr>
+          <w:b w:val="off"/>
+          <w:sz w:val="22"/>
+        </w:rPr>
+        <w:t>{{FINSI:CCAG-TRAVAUX}}</w:t>
       </w:r>
     </w:p>
     <w:p>
@@ -3249,7 +3379,72 @@
           <w:b w:val="off"/>
           <w:sz w:val="22"/>
         </w:rPr>
+        <w:t>{{SI:CCAG-FOURNITURES}}</w:t>
+      </w:r>
+    </w:p>
+    <w:p>
+      <w:pPr>
+        <w:spacing w:after="120"/>
+        <w:jc w:val="both"/>
+      </w:pPr>
+      <w:r>
+        <w:rPr>
+          <w:b w:val="off"/>
+          <w:sz w:val="22"/>
+        </w:rPr>
         <w:t>Le titulaire pourra sous-traiter une partie de l’exécution des prestations faisant l’objet des marchés subséquents dans les conditions prévues par l’article 5.2 du CCAG Fournitures</w:t>
+      </w:r>
+    </w:p>
+    <w:p>
+      <w:pPr>
+        <w:spacing w:after="120"/>
+        <w:jc w:val="both"/>
+      </w:pPr>
+      <w:r>
+        <w:rPr>
+          <w:b w:val="off"/>
+          <w:sz w:val="22"/>
+        </w:rPr>
+        <w:t>{{FINSI:CCAG-FOURNITURES}}</w:t>
+      </w:r>
+    </w:p>
+    <w:p>
+      <w:pPr>
+        <w:spacing w:after="120"/>
+        <w:jc w:val="both"/>
+      </w:pPr>
+      <w:r>
+        <w:rPr>
+          <w:b w:val="off"/>
+          <w:sz w:val="22"/>
+        </w:rPr>
+        <w:t>{{SI:CCAG-TRAVAUX}}</w:t>
+      </w:r>
+    </w:p>
+    <w:p>
+      <w:pPr>
+        <w:spacing w:after="120"/>
+        <w:jc w:val="both"/>
+      </w:pPr>
+      <w:r>
+        <w:rPr>
+          <w:b w:val="off"/>
+          <w:sz w:val="22"/>
+        </w:rPr>
+        <w:t>Le titulaire pourra sous-traiter une partie de l’exécution des prestations faisant l’objet des marchés subséquents dans les conditions prévues par l’article 2.4 du CCAG Travaux</w:t>
+      </w:r>
+    </w:p>
+    <w:p>
+      <w:pPr>
+        <w:spacing w:after="120"/>
+        <w:jc w:val="both"/>
+      </w:pPr>
+      <w:r>
+        <w:rPr>
+          <w:b w:val="off"/>
+          <w:sz w:val="22"/>
+        </w:rPr>
+        <w:t>{{FINSI:CCAG-TRAVAUX}}</w:t>
       </w:r>
     </w:p>
     <w:p>
@@ -3444,7 +3639,72 @@
           <w:b w:val="off"/>
           <w:sz w:val="22"/>
         </w:rPr>
+        <w:t>{{SI:CCAG-FOURNITURES}}</w:t>
+      </w:r>
+    </w:p>
+    <w:p>
+      <w:pPr>
+        <w:spacing w:after="120"/>
+        <w:jc w:val="both"/>
+      </w:pPr>
+      <w:r>
+        <w:rPr>
+          <w:b w:val="off"/>
+          <w:sz w:val="22"/>
+        </w:rPr>
         <w:t>Les opérations de vérification s’effectueront conformément aux articles 21 et 22 du CCAG Fournitures</w:t>
+      </w:r>
+    </w:p>
+    <w:p>
+      <w:pPr>
+        <w:spacing w:after="120"/>
+        <w:jc w:val="both"/>
+      </w:pPr>
+      <w:r>
+        <w:rPr>
+          <w:b w:val="off"/>
+          <w:sz w:val="22"/>
+        </w:rPr>
+        <w:t>{{FINSI:CCAG-FOURNITURES}}</w:t>
+      </w:r>
+    </w:p>
+    <w:p>
+      <w:pPr>
+        <w:spacing w:after="120"/>
+        <w:jc w:val="both"/>
+      </w:pPr>
+      <w:r>
+        <w:rPr>
+          <w:b w:val="off"/>
+          <w:sz w:val="22"/>
+        </w:rPr>
+        <w:t>{{SI:CCAG-TRAVAUX}}</w:t>
+      </w:r>
+    </w:p>
+    <w:p>
+      <w:pPr>
+        <w:spacing w:after="120"/>
+        <w:jc w:val="both"/>
+      </w:pPr>
+      <w:r>
+        <w:rPr>
+          <w:b w:val="off"/>
+          <w:sz w:val="22"/>
+        </w:rPr>
+        <w:t>Les opérations de vérification s’effectueront conformément aux articles 41, 42 et 43 du CCAG Travaux</w:t>
+      </w:r>
+    </w:p>
+    <w:p>
+      <w:pPr>
+        <w:spacing w:after="120"/>
+        <w:jc w:val="both"/>
+      </w:pPr>
+      <w:r>
+        <w:rPr>
+          <w:b w:val="off"/>
+          <w:sz w:val="22"/>
+        </w:rPr>
+        <w:t>{{FINSI:CCAG-TRAVAUX}}</w:t>
       </w:r>
     </w:p>
     <w:p>
@@ -3691,7 +3951,72 @@
           <w:b w:val="off"/>
           <w:sz w:val="22"/>
         </w:rPr>
+        <w:t>{{SI:CCAG-FOURNITURES}}</w:t>
+      </w:r>
+    </w:p>
+    <w:p>
+      <w:pPr>
+        <w:spacing w:after="120"/>
+        <w:jc w:val="both"/>
+      </w:pPr>
+      <w:r>
+        <w:rPr>
+          <w:b w:val="off"/>
+          <w:sz w:val="22"/>
+        </w:rPr>
         <w:t>La garantie sera exécutée conformément aux articles 13 et 23 du CCAG Fournitures</w:t>
+      </w:r>
+    </w:p>
+    <w:p>
+      <w:pPr>
+        <w:spacing w:after="120"/>
+        <w:jc w:val="both"/>
+      </w:pPr>
+      <w:r>
+        <w:rPr>
+          <w:b w:val="off"/>
+          <w:sz w:val="22"/>
+        </w:rPr>
+        <w:t>{{FINSI:CCAG-FOURNITURES}}</w:t>
+      </w:r>
+    </w:p>
+    <w:p>
+      <w:pPr>
+        <w:spacing w:after="120"/>
+        <w:jc w:val="both"/>
+      </w:pPr>
+      <w:r>
+        <w:rPr>
+          <w:b w:val="off"/>
+          <w:sz w:val="22"/>
+        </w:rPr>
+        <w:t>{{SI:CCAG-TRAVAUX}}</w:t>
+      </w:r>
+    </w:p>
+    <w:p>
+      <w:pPr>
+        <w:spacing w:after="120"/>
+        <w:jc w:val="both"/>
+      </w:pPr>
+      <w:r>
+        <w:rPr>
+          <w:b w:val="off"/>
+          <w:sz w:val="22"/>
+        </w:rPr>
+        <w:t>La garantie sera exécutée conformément à l’article 44 du CCAG Travaux</w:t>
+      </w:r>
+    </w:p>
+    <w:p>
+      <w:pPr>
+        <w:spacing w:after="120"/>
+        <w:jc w:val="both"/>
+      </w:pPr>
+      <w:r>
+        <w:rPr>
+          <w:b w:val="off"/>
+          <w:sz w:val="22"/>
+        </w:rPr>
+        <w:t>{{FINSI:CCAG-TRAVAUX}}</w:t>
       </w:r>
     </w:p>
     <w:p>
@@ -4315,7 +4640,72 @@
           <w:b w:val="off"/>
           <w:sz w:val="22"/>
         </w:rPr>
+        <w:t>{{SI:CCAG-FOURNITURES}}</w:t>
+      </w:r>
+    </w:p>
+    <w:p>
+      <w:pPr>
+        <w:spacing w:after="120"/>
+        <w:jc w:val="both"/>
+      </w:pPr>
+      <w:r>
+        <w:rPr>
+          <w:b w:val="off"/>
+          <w:sz w:val="22"/>
+        </w:rPr>
         <w:t>La résiliation pourra être prononcée dans l’exécution des prestations des marchés subséquents conformément aux articles 24 à 33 du CCAG Fournitures</w:t>
+      </w:r>
+    </w:p>
+    <w:p>
+      <w:pPr>
+        <w:spacing w:after="120"/>
+        <w:jc w:val="both"/>
+      </w:pPr>
+      <w:r>
+        <w:rPr>
+          <w:b w:val="off"/>
+          <w:sz w:val="22"/>
+        </w:rPr>
+        <w:t>{{FINSI:CCAG-FOURNITURES}}</w:t>
+      </w:r>
+    </w:p>
+    <w:p>
+      <w:pPr>
+        <w:spacing w:after="120"/>
+        <w:jc w:val="both"/>
+      </w:pPr>
+      <w:r>
+        <w:rPr>
+          <w:b w:val="off"/>
+          <w:sz w:val="22"/>
+        </w:rPr>
+        <w:t>{{SI:CCAG-TRAVAUX}}</w:t>
+      </w:r>
+    </w:p>
+    <w:p>
+      <w:pPr>
+        <w:spacing w:after="120"/>
+        <w:jc w:val="both"/>
+      </w:pPr>
+      <w:r>
+        <w:rPr>
+          <w:b w:val="off"/>
+          <w:sz w:val="22"/>
+        </w:rPr>
+        <w:t>La résiliation pourra être prononcée dans l’exécution des prestations des marchés subséquents conformément aux articles 46 du CCAG Travaux</w:t>
+      </w:r>
+    </w:p>
+    <w:p>
+      <w:pPr>
+        <w:spacing w:after="120"/>
+        <w:jc w:val="both"/>
+      </w:pPr>
+      <w:r>
+        <w:rPr>
+          <w:b w:val="off"/>
+          <w:sz w:val="22"/>
+        </w:rPr>
+        <w:t>{{FINSI:CCAG-TRAVAUX}}</w:t>
       </w:r>
     </w:p>
     <w:p>

</xml_diff>